<commit_message>
Add paid subscription plan to Vera Word document
Tiers, page description, welcome message and first-month content plan.

Co-Authored-By: Claude Opus 5.5 <noreply@anthropic.com>
Claude-Session: https://claude.ai/code/session_01TCTKL38iwdzYsgFgkBGetE
</commit_message>
<xml_diff>
--- a/persona/Вера_Сомова_образ.docx
+++ b/persona/Вера_Сомова_образ.docx
@@ -3081,6 +3081,840 @@
             </w:r>
             <w:r>
               <w:t xml:space="preserve">. Иногда они появляются в кадре — руками с чеками.»</w:t>
+            </w:r>
+          </w:p>
+        </w:tc>
+      </w:tr>
+    </w:tbl>
+    <w:p>
+      <w:pPr>
+        <w:pStyle w:val="Heading1"/>
+      </w:pPr>
+      <w:r>
+        <w:t xml:space="preserve">11. Платная подписка «Клуб Веры»</w:t>
+      </w:r>
+    </w:p>
+    <w:p>
+      <w:pPr>
+        <w:spacing w:after="120"/>
+      </w:pPr>
+      <w:r>
+        <w:t xml:space="preserve">Где запускать: Boosty, Patreon или платный Telegram-канал. Перед запуском проверьте правила площадки про ИИ-персонажей.</w:t>
+      </w:r>
+    </w:p>
+    <w:p>
+      <w:pPr>
+        <w:pStyle w:val="Heading2"/>
+      </w:pPr>
+      <w:r>
+        <w:t xml:space="preserve">Уровни подписки</w:t>
+      </w:r>
+    </w:p>
+    <w:tbl>
+      <w:tblPr>
+        <w:tblW w:type="dxa" w:w="9638"/>
+        <w:tblBorders>
+          <w:top w:val="single" w:color="auto" w:sz="4"/>
+          <w:left w:val="single" w:color="auto" w:sz="4"/>
+          <w:bottom w:val="single" w:color="auto" w:sz="4"/>
+          <w:right w:val="single" w:color="auto" w:sz="4"/>
+          <w:insideH w:val="single" w:color="auto" w:sz="4"/>
+          <w:insideV w:val="single" w:color="auto" w:sz="4"/>
+        </w:tblBorders>
+      </w:tblPr>
+      <w:tblGrid>
+        <w:gridCol w:w="2300"/>
+        <w:gridCol w:w="1500"/>
+        <w:gridCol w:w="5838"/>
+      </w:tblGrid>
+      <w:tr>
+        <w:trPr>
+          <w:tblHeader/>
+        </w:trPr>
+        <w:tc>
+          <w:tcPr>
+            <w:tcW w:type="dxa" w:w="2300"/>
+            <w:tcBorders>
+              <w:top w:val="single" w:color="CCCCCC" w:sz="4"/>
+              <w:left w:val="single" w:color="CCCCCC" w:sz="4"/>
+              <w:bottom w:val="single" w:color="CCCCCC" w:sz="4"/>
+              <w:right w:val="single" w:color="CCCCCC" w:sz="4"/>
+            </w:tcBorders>
+            <w:shd w:fill="5B6B3A" w:color="auto" w:val="clear"/>
+            <w:tcMar>
+              <w:top w:type="dxa" w:w="80"/>
+              <w:left w:type="dxa" w:w="120"/>
+              <w:bottom w:type="dxa" w:w="80"/>
+              <w:right w:type="dxa" w:w="120"/>
+            </w:tcMar>
+          </w:tcPr>
+          <w:p>
+            <w:r>
+              <w:rPr>
+                <w:b/>
+                <w:bCs/>
+                <w:color w:val="FFFFFF"/>
+              </w:rPr>
+              <w:t xml:space="preserve">Уровень</w:t>
+            </w:r>
+          </w:p>
+        </w:tc>
+        <w:tc>
+          <w:tcPr>
+            <w:tcW w:type="dxa" w:w="1500"/>
+            <w:tcBorders>
+              <w:top w:val="single" w:color="CCCCCC" w:sz="4"/>
+              <w:left w:val="single" w:color="CCCCCC" w:sz="4"/>
+              <w:bottom w:val="single" w:color="CCCCCC" w:sz="4"/>
+              <w:right w:val="single" w:color="CCCCCC" w:sz="4"/>
+            </w:tcBorders>
+            <w:shd w:fill="5B6B3A" w:color="auto" w:val="clear"/>
+            <w:tcMar>
+              <w:top w:type="dxa" w:w="80"/>
+              <w:left w:type="dxa" w:w="120"/>
+              <w:bottom w:type="dxa" w:w="80"/>
+              <w:right w:type="dxa" w:w="120"/>
+            </w:tcMar>
+          </w:tcPr>
+          <w:p>
+            <w:r>
+              <w:rPr>
+                <w:b/>
+                <w:bCs/>
+                <w:color w:val="FFFFFF"/>
+              </w:rPr>
+              <w:t xml:space="preserve">Цена в месяц</w:t>
+            </w:r>
+          </w:p>
+        </w:tc>
+        <w:tc>
+          <w:tcPr>
+            <w:tcW w:type="dxa" w:w="5838"/>
+            <w:tcBorders>
+              <w:top w:val="single" w:color="CCCCCC" w:sz="4"/>
+              <w:left w:val="single" w:color="CCCCCC" w:sz="4"/>
+              <w:bottom w:val="single" w:color="CCCCCC" w:sz="4"/>
+              <w:right w:val="single" w:color="CCCCCC" w:sz="4"/>
+            </w:tcBorders>
+            <w:shd w:fill="5B6B3A" w:color="auto" w:val="clear"/>
+            <w:tcMar>
+              <w:top w:type="dxa" w:w="80"/>
+              <w:left w:type="dxa" w:w="120"/>
+              <w:bottom w:type="dxa" w:w="80"/>
+              <w:right w:type="dxa" w:w="120"/>
+            </w:tcMar>
+          </w:tcPr>
+          <w:p>
+            <w:r>
+              <w:rPr>
+                <w:b/>
+                <w:bCs/>
+                <w:color w:val="FFFFFF"/>
+              </w:rPr>
+              <w:t xml:space="preserve">Что получает подписчик</w:t>
+            </w:r>
+          </w:p>
+        </w:tc>
+      </w:tr>
+      <w:tr>
+        <w:trPr>
+          <w:tblHeader w:val="false"/>
+        </w:trPr>
+        <w:tc>
+          <w:tcPr>
+            <w:tcW w:type="dxa" w:w="2300"/>
+            <w:tcBorders>
+              <w:top w:val="single" w:color="CCCCCC" w:sz="4"/>
+              <w:left w:val="single" w:color="CCCCCC" w:sz="4"/>
+              <w:bottom w:val="single" w:color="CCCCCC" w:sz="4"/>
+              <w:right w:val="single" w:color="CCCCCC" w:sz="4"/>
+            </w:tcBorders>
+            <w:tcMar>
+              <w:top w:type="dxa" w:w="80"/>
+              <w:left w:type="dxa" w:w="120"/>
+              <w:bottom w:type="dxa" w:w="80"/>
+              <w:right w:type="dxa" w:w="120"/>
+            </w:tcMar>
+          </w:tcPr>
+          <w:p>
+            <w:r>
+              <w:t xml:space="preserve">Таблицы</w:t>
+            </w:r>
+          </w:p>
+        </w:tc>
+        <w:tc>
+          <w:tcPr>
+            <w:tcW w:type="dxa" w:w="1500"/>
+            <w:tcBorders>
+              <w:top w:val="single" w:color="CCCCCC" w:sz="4"/>
+              <w:left w:val="single" w:color="CCCCCC" w:sz="4"/>
+              <w:bottom w:val="single" w:color="CCCCCC" w:sz="4"/>
+              <w:right w:val="single" w:color="CCCCCC" w:sz="4"/>
+            </w:tcBorders>
+            <w:tcMar>
+              <w:top w:type="dxa" w:w="80"/>
+              <w:left w:type="dxa" w:w="120"/>
+              <w:bottom w:type="dxa" w:w="80"/>
+              <w:right w:type="dxa" w:w="120"/>
+            </w:tcMar>
+          </w:tcPr>
+          <w:p>
+            <w:r>
+              <w:t xml:space="preserve">3 €</w:t>
+            </w:r>
+          </w:p>
+        </w:tc>
+        <w:tc>
+          <w:tcPr>
+            <w:tcW w:type="dxa" w:w="5838"/>
+            <w:tcBorders>
+              <w:top w:val="single" w:color="CCCCCC" w:sz="4"/>
+              <w:left w:val="single" w:color="CCCCCC" w:sz="4"/>
+              <w:bottom w:val="single" w:color="CCCCCC" w:sz="4"/>
+              <w:right w:val="single" w:color="CCCCCC" w:sz="4"/>
+            </w:tcBorders>
+            <w:tcMar>
+              <w:top w:type="dxa" w:w="80"/>
+              <w:left w:type="dxa" w:w="120"/>
+              <w:bottom w:type="dxa" w:w="80"/>
+              <w:right w:type="dxa" w:w="120"/>
+            </w:tcMar>
+          </w:tcPr>
+          <w:p>
+            <w:r>
+              <w:t xml:space="preserve">Полный «Индекс Веры» каждый понедельник (цены в 10 городах), шаблон таблицы расходов на поездку, ролики на день раньше всех.</w:t>
+            </w:r>
+          </w:p>
+        </w:tc>
+      </w:tr>
+      <w:tr>
+        <w:trPr>
+          <w:tblHeader w:val="false"/>
+        </w:trPr>
+        <w:tc>
+          <w:tcPr>
+            <w:tcW w:type="dxa" w:w="2300"/>
+            <w:tcBorders>
+              <w:top w:val="single" w:color="CCCCCC" w:sz="4"/>
+              <w:left w:val="single" w:color="CCCCCC" w:sz="4"/>
+              <w:bottom w:val="single" w:color="CCCCCC" w:sz="4"/>
+              <w:right w:val="single" w:color="CCCCCC" w:sz="4"/>
+            </w:tcBorders>
+            <w:tcMar>
+              <w:top w:type="dxa" w:w="80"/>
+              <w:left w:type="dxa" w:w="120"/>
+              <w:bottom w:type="dxa" w:w="80"/>
+              <w:right w:type="dxa" w:w="120"/>
+            </w:tcMar>
+          </w:tcPr>
+          <w:p>
+            <w:r>
+              <w:t xml:space="preserve">Как поехать</w:t>
+            </w:r>
+          </w:p>
+        </w:tc>
+        <w:tc>
+          <w:tcPr>
+            <w:tcW w:type="dxa" w:w="1500"/>
+            <w:tcBorders>
+              <w:top w:val="single" w:color="CCCCCC" w:sz="4"/>
+              <w:left w:val="single" w:color="CCCCCC" w:sz="4"/>
+              <w:bottom w:val="single" w:color="CCCCCC" w:sz="4"/>
+              <w:right w:val="single" w:color="CCCCCC" w:sz="4"/>
+            </w:tcBorders>
+            <w:tcMar>
+              <w:top w:type="dxa" w:w="80"/>
+              <w:left w:type="dxa" w:w="120"/>
+              <w:bottom w:type="dxa" w:w="80"/>
+              <w:right w:type="dxa" w:w="120"/>
+            </w:tcMar>
+          </w:tcPr>
+          <w:p>
+            <w:r>
+              <w:t xml:space="preserve">9 €</w:t>
+            </w:r>
+          </w:p>
+        </w:tc>
+        <w:tc>
+          <w:tcPr>
+            <w:tcW w:type="dxa" w:w="5838"/>
+            <w:tcBorders>
+              <w:top w:val="single" w:color="CCCCCC" w:sz="4"/>
+              <w:left w:val="single" w:color="CCCCCC" w:sz="4"/>
+              <w:bottom w:val="single" w:color="CCCCCC" w:sz="4"/>
+              <w:right w:val="single" w:color="CCCCCC" w:sz="4"/>
+            </w:tcBorders>
+            <w:tcMar>
+              <w:top w:type="dxa" w:w="80"/>
+              <w:left w:type="dxa" w:w="120"/>
+              <w:bottom w:type="dxa" w:w="80"/>
+              <w:right w:type="dxa" w:w="120"/>
+            </w:tcMar>
+          </w:tcPr>
+          <w:p>
+            <w:r>
+              <w:t xml:space="preserve">Всё из «Таблиц» + один большой гайд в месяц, закрытый чат, разбор вопросов подписчиков по пятницам, голосование за следующий город.</w:t>
+            </w:r>
+          </w:p>
+        </w:tc>
+      </w:tr>
+      <w:tr>
+        <w:trPr>
+          <w:tblHeader w:val="false"/>
+        </w:trPr>
+        <w:tc>
+          <w:tcPr>
+            <w:tcW w:type="dxa" w:w="2300"/>
+            <w:tcBorders>
+              <w:top w:val="single" w:color="CCCCCC" w:sz="4"/>
+              <w:left w:val="single" w:color="CCCCCC" w:sz="4"/>
+              <w:bottom w:val="single" w:color="CCCCCC" w:sz="4"/>
+              <w:right w:val="single" w:color="CCCCCC" w:sz="4"/>
+            </w:tcBorders>
+            <w:tcMar>
+              <w:top w:type="dxa" w:w="80"/>
+              <w:left w:type="dxa" w:w="120"/>
+              <w:bottom w:type="dxa" w:w="80"/>
+              <w:right w:type="dxa" w:w="120"/>
+            </w:tcMar>
+          </w:tcPr>
+          <w:p>
+            <w:r>
+              <w:t xml:space="preserve">Под ключ</w:t>
+            </w:r>
+          </w:p>
+        </w:tc>
+        <w:tc>
+          <w:tcPr>
+            <w:tcW w:type="dxa" w:w="1500"/>
+            <w:tcBorders>
+              <w:top w:val="single" w:color="CCCCCC" w:sz="4"/>
+              <w:left w:val="single" w:color="CCCCCC" w:sz="4"/>
+              <w:bottom w:val="single" w:color="CCCCCC" w:sz="4"/>
+              <w:right w:val="single" w:color="CCCCCC" w:sz="4"/>
+            </w:tcBorders>
+            <w:tcMar>
+              <w:top w:type="dxa" w:w="80"/>
+              <w:left w:type="dxa" w:w="120"/>
+              <w:bottom w:type="dxa" w:w="80"/>
+              <w:right w:type="dxa" w:w="120"/>
+            </w:tcMar>
+          </w:tcPr>
+          <w:p>
+            <w:r>
+              <w:t xml:space="preserve">29 €</w:t>
+            </w:r>
+          </w:p>
+        </w:tc>
+        <w:tc>
+          <w:tcPr>
+            <w:tcW w:type="dxa" w:w="5838"/>
+            <w:tcBorders>
+              <w:top w:val="single" w:color="CCCCCC" w:sz="4"/>
+              <w:left w:val="single" w:color="CCCCCC" w:sz="4"/>
+              <w:bottom w:val="single" w:color="CCCCCC" w:sz="4"/>
+              <w:right w:val="single" w:color="CCCCCC" w:sz="4"/>
+            </w:tcBorders>
+            <w:tcMar>
+              <w:top w:type="dxa" w:w="80"/>
+              <w:left w:type="dxa" w:w="120"/>
+              <w:bottom w:type="dxa" w:w="80"/>
+              <w:right w:type="dxa" w:w="120"/>
+            </w:tcMar>
+          </w:tcPr>
+          <w:p>
+            <w:r>
+              <w:t xml:space="preserve">Всё из «Как поехать» + личная смета вашей поездки раз в месяц. Смету составляет автор проекта по шаблону Веры.</w:t>
+            </w:r>
+          </w:p>
+        </w:tc>
+      </w:tr>
+    </w:tbl>
+    <w:p>
+      <w:pPr>
+        <w:spacing w:after="120"/>
+      </w:pPr>
+    </w:p>
+    <w:p>
+      <w:pPr>
+        <w:pStyle w:val="Heading2"/>
+      </w:pPr>
+      <w:r>
+        <w:t xml:space="preserve">Описание страницы</w:t>
+      </w:r>
+    </w:p>
+    <w:p>
+      <w:pPr>
+        <w:pBdr>
+          <w:left w:val="single" w:color="5B6B3A" w:sz="24" w:space="8"/>
+        </w:pBdr>
+        <w:shd w:fill="F4F1E8" w:color="auto" w:val="clear"/>
+        <w:spacing w:after="0" w:line="300"/>
+        <w:ind w:left="200" w:right="200"/>
+      </w:pPr>
+      <w:r>
+        <w:rPr>
+          <w:i/>
+          <w:iCs/>
+        </w:rPr>
+        <w:t xml:space="preserve">Клуб Веры: Европа без переплат</w:t>
+      </w:r>
+    </w:p>
+    <w:p>
+      <w:pPr>
+        <w:pBdr>
+          <w:left w:val="single" w:color="5B6B3A" w:sz="24" w:space="8"/>
+        </w:pBdr>
+        <w:shd w:fill="F4F1E8" w:color="auto" w:val="clear"/>
+        <w:spacing w:after="0" w:line="300"/>
+        <w:ind w:left="200" w:right="200"/>
+      </w:pPr>
+      <w:r>
+        <w:rPr>
+          <w:i/>
+          <w:iCs/>
+        </w:rPr>
+        <w:t xml:space="preserve">Я Вера, ИИ-ведущая. Моя история придумана, а цифры настоящие: цены, чеки и источники собирает и проверяет автор проекта.</w:t>
+      </w:r>
+    </w:p>
+    <w:p>
+      <w:pPr>
+        <w:pBdr>
+          <w:left w:val="single" w:color="5B6B3A" w:sz="24" w:space="8"/>
+        </w:pBdr>
+        <w:shd w:fill="F4F1E8" w:color="auto" w:val="clear"/>
+        <w:spacing w:after="0" w:line="300"/>
+        <w:ind w:left="200" w:right="200"/>
+      </w:pPr>
+      <w:r>
+        <w:rPr>
+          <w:i/>
+          <w:iCs/>
+        </w:rPr>
+        <w:t xml:space="preserve">Здесь то, что не помещается в короткие ролики: полные таблицы цен, гайды по городам и ответы на ваши вопросы.</w:t>
+      </w:r>
+    </w:p>
+    <w:p>
+      <w:pPr>
+        <w:pBdr>
+          <w:left w:val="single" w:color="5B6B3A" w:sz="24" w:space="8"/>
+        </w:pBdr>
+        <w:shd w:fill="F4F1E8" w:color="auto" w:val="clear"/>
+        <w:spacing w:after="0" w:line="300"/>
+        <w:ind w:left="200" w:right="200"/>
+      </w:pPr>
+      <w:r>
+        <w:rPr>
+          <w:i/>
+          <w:iCs/>
+        </w:rPr>
+        <w:t xml:space="preserve">Каждый понедельник — Индекс Веры: сколько стоят кофе, метро и ночь в хостеле в 10 городах Европы.</w:t>
+      </w:r>
+    </w:p>
+    <w:p>
+      <w:pPr>
+        <w:pBdr>
+          <w:left w:val="single" w:color="5B6B3A" w:sz="24" w:space="8"/>
+        </w:pBdr>
+        <w:shd w:fill="F4F1E8" w:color="auto" w:val="clear"/>
+        <w:spacing w:after="0" w:line="300"/>
+        <w:ind w:left="200" w:right="200"/>
+      </w:pPr>
+      <w:r>
+        <w:rPr>
+          <w:i/>
+          <w:iCs/>
+        </w:rPr>
+        <w:t xml:space="preserve">Раз в месяц — большой гайд: как прожить в городе на 60 € в день.</w:t>
+      </w:r>
+    </w:p>
+    <w:p>
+      <w:pPr>
+        <w:pBdr>
+          <w:left w:val="single" w:color="5B6B3A" w:sz="24" w:space="8"/>
+        </w:pBdr>
+        <w:shd w:fill="F4F1E8" w:color="auto" w:val="clear"/>
+        <w:spacing w:after="0" w:line="300"/>
+        <w:ind w:left="200" w:right="200"/>
+      </w:pPr>
+      <w:r>
+        <w:rPr>
+          <w:i/>
+          <w:iCs/>
+        </w:rPr>
+        <w:t xml:space="preserve">Реклама всегда с пометкой. Нашли ошибку — исправим и поблагодарим.</w:t>
+      </w:r>
+    </w:p>
+    <w:p>
+      <w:pPr>
+        <w:pBdr>
+          <w:left w:val="single" w:color="5B6B3A" w:sz="24" w:space="8"/>
+        </w:pBdr>
+        <w:shd w:fill="F4F1E8" w:color="auto" w:val="clear"/>
+        <w:spacing w:after="200" w:line="300"/>
+        <w:ind w:left="200" w:right="200"/>
+      </w:pPr>
+      <w:r>
+        <w:rPr>
+          <w:i/>
+          <w:iCs/>
+        </w:rPr>
+        <w:t xml:space="preserve">Сначала считаем — потом едем.</w:t>
+      </w:r>
+    </w:p>
+    <w:p>
+      <w:pPr>
+        <w:pStyle w:val="Heading2"/>
+      </w:pPr>
+      <w:r>
+        <w:t xml:space="preserve">Приветственное сообщение новому подписчику</w:t>
+      </w:r>
+    </w:p>
+    <w:p>
+      <w:pPr>
+        <w:pBdr>
+          <w:left w:val="single" w:color="5B6B3A" w:sz="24" w:space="8"/>
+        </w:pBdr>
+        <w:shd w:fill="F4F1E8" w:color="auto" w:val="clear"/>
+        <w:spacing w:after="0" w:line="300"/>
+        <w:ind w:left="200" w:right="200"/>
+      </w:pPr>
+      <w:r>
+        <w:rPr>
+          <w:i/>
+          <w:iCs/>
+        </w:rPr>
+        <w:t xml:space="preserve">Привет! Спасибо, что вы здесь.</w:t>
+      </w:r>
+    </w:p>
+    <w:p>
+      <w:pPr>
+        <w:pBdr>
+          <w:left w:val="single" w:color="5B6B3A" w:sz="24" w:space="8"/>
+        </w:pBdr>
+        <w:shd w:fill="F4F1E8" w:color="auto" w:val="clear"/>
+        <w:spacing w:after="0" w:line="300"/>
+        <w:ind w:left="200" w:right="200"/>
+      </w:pPr>
+      <w:r>
+        <w:rPr>
+          <w:i/>
+          <w:iCs/>
+        </w:rPr>
+        <w:t xml:space="preserve">Коротко, как всё устроено: по понедельникам — Индекс Веры, раз в месяц — большой гайд. Вопросы пишите под закреплённым постом, разбираю их по пятницам.</w:t>
+      </w:r>
+    </w:p>
+    <w:p>
+      <w:pPr>
+        <w:pBdr>
+          <w:left w:val="single" w:color="5B6B3A" w:sz="24" w:space="8"/>
+        </w:pBdr>
+        <w:shd w:fill="F4F1E8" w:color="auto" w:val="clear"/>
+        <w:spacing w:after="0" w:line="300"/>
+        <w:ind w:left="200" w:right="200"/>
+      </w:pPr>
+      <w:r>
+        <w:rPr>
+          <w:i/>
+          <w:iCs/>
+        </w:rPr>
+        <w:t xml:space="preserve">Шаблон таблицы расходов уже ждёт вас в первом посте — скопируйте его себе.</w:t>
+      </w:r>
+    </w:p>
+    <w:p>
+      <w:pPr>
+        <w:pBdr>
+          <w:left w:val="single" w:color="5B6B3A" w:sz="24" w:space="8"/>
+        </w:pBdr>
+        <w:shd w:fill="F4F1E8" w:color="auto" w:val="clear"/>
+        <w:spacing w:after="200" w:line="300"/>
+        <w:ind w:left="200" w:right="200"/>
+      </w:pPr>
+      <w:r>
+        <w:rPr>
+          <w:i/>
+          <w:iCs/>
+        </w:rPr>
+        <w:t xml:space="preserve">Сначала считаем — потом едем.</w:t>
+      </w:r>
+    </w:p>
+    <w:p>
+      <w:pPr>
+        <w:pStyle w:val="Heading2"/>
+      </w:pPr>
+      <w:r>
+        <w:t xml:space="preserve">План на первый месяц</w:t>
+      </w:r>
+    </w:p>
+    <w:tbl>
+      <w:tblPr>
+        <w:tblW w:type="dxa" w:w="9638"/>
+        <w:tblBorders>
+          <w:top w:val="single" w:color="auto" w:sz="4"/>
+          <w:left w:val="single" w:color="auto" w:sz="4"/>
+          <w:bottom w:val="single" w:color="auto" w:sz="4"/>
+          <w:right w:val="single" w:color="auto" w:sz="4"/>
+          <w:insideH w:val="single" w:color="auto" w:sz="4"/>
+          <w:insideV w:val="single" w:color="auto" w:sz="4"/>
+        </w:tblBorders>
+      </w:tblPr>
+      <w:tblGrid>
+        <w:gridCol w:w="1600"/>
+        <w:gridCol w:w="8038"/>
+      </w:tblGrid>
+      <w:tr>
+        <w:trPr>
+          <w:tblHeader/>
+        </w:trPr>
+        <w:tc>
+          <w:tcPr>
+            <w:tcW w:type="dxa" w:w="1600"/>
+            <w:tcBorders>
+              <w:top w:val="single" w:color="CCCCCC" w:sz="4"/>
+              <w:left w:val="single" w:color="CCCCCC" w:sz="4"/>
+              <w:bottom w:val="single" w:color="CCCCCC" w:sz="4"/>
+              <w:right w:val="single" w:color="CCCCCC" w:sz="4"/>
+            </w:tcBorders>
+            <w:shd w:fill="5B6B3A" w:color="auto" w:val="clear"/>
+            <w:tcMar>
+              <w:top w:type="dxa" w:w="80"/>
+              <w:left w:type="dxa" w:w="120"/>
+              <w:bottom w:type="dxa" w:w="80"/>
+              <w:right w:type="dxa" w:w="120"/>
+            </w:tcMar>
+          </w:tcPr>
+          <w:p>
+            <w:r>
+              <w:rPr>
+                <w:b/>
+                <w:bCs/>
+                <w:color w:val="FFFFFF"/>
+              </w:rPr>
+              <w:t xml:space="preserve">Неделя</w:t>
+            </w:r>
+          </w:p>
+        </w:tc>
+        <w:tc>
+          <w:tcPr>
+            <w:tcW w:type="dxa" w:w="8038"/>
+            <w:tcBorders>
+              <w:top w:val="single" w:color="CCCCCC" w:sz="4"/>
+              <w:left w:val="single" w:color="CCCCCC" w:sz="4"/>
+              <w:bottom w:val="single" w:color="CCCCCC" w:sz="4"/>
+              <w:right w:val="single" w:color="CCCCCC" w:sz="4"/>
+            </w:tcBorders>
+            <w:shd w:fill="5B6B3A" w:color="auto" w:val="clear"/>
+            <w:tcMar>
+              <w:top w:type="dxa" w:w="80"/>
+              <w:left w:type="dxa" w:w="120"/>
+              <w:bottom w:type="dxa" w:w="80"/>
+              <w:right w:type="dxa" w:w="120"/>
+            </w:tcMar>
+          </w:tcPr>
+          <w:p>
+            <w:r>
+              <w:rPr>
+                <w:b/>
+                <w:bCs/>
+                <w:color w:val="FFFFFF"/>
+              </w:rPr>
+              <w:t xml:space="preserve">Что публикуем</w:t>
+            </w:r>
+          </w:p>
+        </w:tc>
+      </w:tr>
+      <w:tr>
+        <w:trPr>
+          <w:tblHeader w:val="false"/>
+        </w:trPr>
+        <w:tc>
+          <w:tcPr>
+            <w:tcW w:type="dxa" w:w="1600"/>
+            <w:tcBorders>
+              <w:top w:val="single" w:color="CCCCCC" w:sz="4"/>
+              <w:left w:val="single" w:color="CCCCCC" w:sz="4"/>
+              <w:bottom w:val="single" w:color="CCCCCC" w:sz="4"/>
+              <w:right w:val="single" w:color="CCCCCC" w:sz="4"/>
+            </w:tcBorders>
+            <w:tcMar>
+              <w:top w:type="dxa" w:w="80"/>
+              <w:left w:type="dxa" w:w="120"/>
+              <w:bottom w:type="dxa" w:w="80"/>
+              <w:right w:type="dxa" w:w="120"/>
+            </w:tcMar>
+          </w:tcPr>
+          <w:p>
+            <w:r>
+              <w:t xml:space="preserve">1</w:t>
+            </w:r>
+          </w:p>
+        </w:tc>
+        <w:tc>
+          <w:tcPr>
+            <w:tcW w:type="dxa" w:w="8038"/>
+            <w:tcBorders>
+              <w:top w:val="single" w:color="CCCCCC" w:sz="4"/>
+              <w:left w:val="single" w:color="CCCCCC" w:sz="4"/>
+              <w:bottom w:val="single" w:color="CCCCCC" w:sz="4"/>
+              <w:right w:val="single" w:color="CCCCCC" w:sz="4"/>
+            </w:tcBorders>
+            <w:tcMar>
+              <w:top w:type="dxa" w:w="80"/>
+              <w:left w:type="dxa" w:w="120"/>
+              <w:bottom w:type="dxa" w:w="80"/>
+              <w:right w:type="dxa" w:w="120"/>
+            </w:tcMar>
+          </w:tcPr>
+          <w:p>
+            <w:r>
+              <w:t xml:space="preserve">Приветственный пост и шаблон таблицы расходов. Индекс Веры №1: Мадрид, Барселона, Валенсия, Лиссабон, Порту, Рим, Прага, Будапешт, Варшава, Берлин.</w:t>
+            </w:r>
+          </w:p>
+        </w:tc>
+      </w:tr>
+      <w:tr>
+        <w:trPr>
+          <w:tblHeader w:val="false"/>
+        </w:trPr>
+        <w:tc>
+          <w:tcPr>
+            <w:tcW w:type="dxa" w:w="1600"/>
+            <w:tcBorders>
+              <w:top w:val="single" w:color="CCCCCC" w:sz="4"/>
+              <w:left w:val="single" w:color="CCCCCC" w:sz="4"/>
+              <w:bottom w:val="single" w:color="CCCCCC" w:sz="4"/>
+              <w:right w:val="single" w:color="CCCCCC" w:sz="4"/>
+            </w:tcBorders>
+            <w:tcMar>
+              <w:top w:type="dxa" w:w="80"/>
+              <w:left w:type="dxa" w:w="120"/>
+              <w:bottom w:type="dxa" w:w="80"/>
+              <w:right w:type="dxa" w:w="120"/>
+            </w:tcMar>
+          </w:tcPr>
+          <w:p>
+            <w:r>
+              <w:t xml:space="preserve">2</w:t>
+            </w:r>
+          </w:p>
+        </w:tc>
+        <w:tc>
+          <w:tcPr>
+            <w:tcW w:type="dxa" w:w="8038"/>
+            <w:tcBorders>
+              <w:top w:val="single" w:color="CCCCCC" w:sz="4"/>
+              <w:left w:val="single" w:color="CCCCCC" w:sz="4"/>
+              <w:bottom w:val="single" w:color="CCCCCC" w:sz="4"/>
+              <w:right w:val="single" w:color="CCCCCC" w:sz="4"/>
+            </w:tcBorders>
+            <w:tcMar>
+              <w:top w:type="dxa" w:w="80"/>
+              <w:left w:type="dxa" w:w="120"/>
+              <w:bottom w:type="dxa" w:w="80"/>
+              <w:right w:type="dxa" w:w="120"/>
+            </w:tcMar>
+          </w:tcPr>
+          <w:p>
+            <w:r>
+              <w:t xml:space="preserve">Индекс Веры №2. Большой гайд «Валенсия за 60 € в день».</w:t>
+            </w:r>
+          </w:p>
+        </w:tc>
+      </w:tr>
+      <w:tr>
+        <w:trPr>
+          <w:tblHeader w:val="false"/>
+        </w:trPr>
+        <w:tc>
+          <w:tcPr>
+            <w:tcW w:type="dxa" w:w="1600"/>
+            <w:tcBorders>
+              <w:top w:val="single" w:color="CCCCCC" w:sz="4"/>
+              <w:left w:val="single" w:color="CCCCCC" w:sz="4"/>
+              <w:bottom w:val="single" w:color="CCCCCC" w:sz="4"/>
+              <w:right w:val="single" w:color="CCCCCC" w:sz="4"/>
+            </w:tcBorders>
+            <w:tcMar>
+              <w:top w:type="dxa" w:w="80"/>
+              <w:left w:type="dxa" w:w="120"/>
+              <w:bottom w:type="dxa" w:w="80"/>
+              <w:right w:type="dxa" w:w="120"/>
+            </w:tcMar>
+          </w:tcPr>
+          <w:p>
+            <w:r>
+              <w:t xml:space="preserve">3</w:t>
+            </w:r>
+          </w:p>
+        </w:tc>
+        <w:tc>
+          <w:tcPr>
+            <w:tcW w:type="dxa" w:w="8038"/>
+            <w:tcBorders>
+              <w:top w:val="single" w:color="CCCCCC" w:sz="4"/>
+              <w:left w:val="single" w:color="CCCCCC" w:sz="4"/>
+              <w:bottom w:val="single" w:color="CCCCCC" w:sz="4"/>
+              <w:right w:val="single" w:color="CCCCCC" w:sz="4"/>
+            </w:tcBorders>
+            <w:tcMar>
+              <w:top w:type="dxa" w:w="80"/>
+              <w:left w:type="dxa" w:w="120"/>
+              <w:bottom w:type="dxa" w:w="80"/>
+              <w:right w:type="dxa" w:w="120"/>
+            </w:tcMar>
+          </w:tcPr>
+          <w:p>
+            <w:r>
+              <w:t xml:space="preserve">Индекс Веры №3. Разбор вопросов подписчиков.</w:t>
+            </w:r>
+          </w:p>
+        </w:tc>
+      </w:tr>
+      <w:tr>
+        <w:trPr>
+          <w:tblHeader w:val="false"/>
+        </w:trPr>
+        <w:tc>
+          <w:tcPr>
+            <w:tcW w:type="dxa" w:w="1600"/>
+            <w:tcBorders>
+              <w:top w:val="single" w:color="CCCCCC" w:sz="4"/>
+              <w:left w:val="single" w:color="CCCCCC" w:sz="4"/>
+              <w:bottom w:val="single" w:color="CCCCCC" w:sz="4"/>
+              <w:right w:val="single" w:color="CCCCCC" w:sz="4"/>
+            </w:tcBorders>
+            <w:tcMar>
+              <w:top w:type="dxa" w:w="80"/>
+              <w:left w:type="dxa" w:w="120"/>
+              <w:bottom w:type="dxa" w:w="80"/>
+              <w:right w:type="dxa" w:w="120"/>
+            </w:tcMar>
+          </w:tcPr>
+          <w:p>
+            <w:r>
+              <w:t xml:space="preserve">4</w:t>
+            </w:r>
+          </w:p>
+        </w:tc>
+        <w:tc>
+          <w:tcPr>
+            <w:tcW w:type="dxa" w:w="8038"/>
+            <w:tcBorders>
+              <w:top w:val="single" w:color="CCCCCC" w:sz="4"/>
+              <w:left w:val="single" w:color="CCCCCC" w:sz="4"/>
+              <w:bottom w:val="single" w:color="CCCCCC" w:sz="4"/>
+              <w:right w:val="single" w:color="CCCCCC" w:sz="4"/>
+            </w:tcBorders>
+            <w:tcMar>
+              <w:top w:type="dxa" w:w="80"/>
+              <w:left w:type="dxa" w:w="120"/>
+              <w:bottom w:type="dxa" w:w="80"/>
+              <w:right w:type="dxa" w:w="120"/>
+            </w:tcMar>
+          </w:tcPr>
+          <w:p>
+            <w:r>
+              <w:t xml:space="preserve">Индекс Веры №4. Закрытый выпуск «Вера ошиблась». Голосование: какой город разбираем в следующем месяце.</w:t>
             </w:r>
           </w:p>
         </w:tc>

</xml_diff>

<commit_message>
Use sharp wall-scene portraits of Vera
Long loose hair, hands in pockets, sharp background; 1152x1408 from
Z-Image-Turbo with 2x upscale (seeds 33 and 14). Word document updated.

Co-Authored-By: Claude Opus 5.5 <noreply@anthropic.com>
Claude-Session: https://claude.ai/code/session_01TCTKL38iwdzYsgFgkBGetE
</commit_message>
<xml_diff>
--- a/persona/Вера_Сомова_образ.docx
+++ b/persona/Вера_Сомова_образ.docx
@@ -40,7 +40,7 @@
       <w:r>
         <w:drawing>
           <wp:inline distT="0" distB="0" distL="0" distR="0">
-            <wp:extent cx="2857500" cy="2781300"/>
+            <wp:extent cx="2857500" cy="3495675"/>
             <wp:effectExtent t="0" r="0" b="0" l="0"/>
             <wp:docPr id="1" name="vera" descr="Портрет Веры Сомовой" title="Вера Сомова"/>
             <wp:cNvGraphicFramePr>
@@ -65,7 +65,7 @@
                   <pic:spPr bwMode="auto">
                     <a:xfrm>
                       <a:off x="0" y="0"/>
-                      <a:ext cx="2857500" cy="2781300"/>
+                      <a:ext cx="2857500" cy="3495675"/>
                     </a:xfrm>
                     <a:prstGeom prst="rect">
                       <a:avLst/>

</xml_diff>